<commit_message>
Add Jira to skills
</commit_message>
<xml_diff>
--- a/Anwar-Orozco-CV.docx
+++ b/Anwar-Orozco-CV.docx
@@ -122,7 +122,7 @@
           <w:color w:val="18181B"/>
           <w:sz w:val="21"/>
         </w:rPr>
-        <w:t xml:space="preserve">Platforms: </w:t>
+        <w:t xml:space="preserve">Platforms &amp; tools: </w:t>
       </w:r>
       <w:r>
         <w:rPr>
@@ -130,7 +130,7 @@
           <w:color w:val="5F5F66"/>
           <w:sz w:val="21"/>
         </w:rPr>
-        <w:t>Salesforce, Magento</w:t>
+        <w:t>Salesforce, Magento, Jira</w:t>
       </w:r>
     </w:p>
     <w:p>

</xml_diff>

<commit_message>
Critique fixes: availability line, grouped skills, monochrome icons, accent numbers, closing CTA
</commit_message>
<xml_diff>
--- a/Anwar-Orozco-CV.docx
+++ b/Anwar-Orozco-CV.docx
@@ -26,6 +26,19 @@
           <w:sz w:val="24"/>
         </w:rPr>
         <w:t>Senior QA Engineer</w:t>
+      </w:r>
+    </w:p>
+    <w:p>
+      <w:pPr>
+        <w:spacing w:after="80" w:before="0" w:line="264" w:lineRule="auto"/>
+      </w:pPr>
+      <w:r>
+        <w:rPr>
+          <w:b/>
+          <w:color w:val="1D4ED8"/>
+          <w:sz w:val="20"/>
+        </w:rPr>
+        <w:t>Open to Senior QA roles · Manual &amp; Automation · Remote / Chihuahua</w:t>
       </w:r>
     </w:p>
     <w:p>
@@ -88,7 +101,7 @@
           <w:color w:val="5F5F66"/>
           <w:sz w:val="21"/>
         </w:rPr>
-        <w:t>Playwright, Karate, AI workflow, AI automation, Claude Code</w:t>
+        <w:t>Playwright, Karate, TypeScript, JavaScript, Claude Code, AI-assisted testing</w:t>
       </w:r>
     </w:p>
     <w:p>
@@ -101,7 +114,7 @@
           <w:color w:val="18181B"/>
           <w:sz w:val="21"/>
         </w:rPr>
-        <w:t xml:space="preserve">Languages &amp; APIs: </w:t>
+        <w:t xml:space="preserve">Testing: </w:t>
       </w:r>
       <w:r>
         <w:rPr>
@@ -109,7 +122,7 @@
           <w:color w:val="5F5F66"/>
           <w:sz w:val="21"/>
         </w:rPr>
-        <w:t>TypeScript, JavaScript, SQL, Postman (API testing)</w:t>
+        <w:t>Manual testing, Test planning, API testing (Postman), SQL, Verification &amp; validation, BDD</w:t>
       </w:r>
     </w:p>
     <w:p>
@@ -122,7 +135,7 @@
           <w:color w:val="18181B"/>
           <w:sz w:val="21"/>
         </w:rPr>
-        <w:t xml:space="preserve">Platforms &amp; tools: </w:t>
+        <w:t xml:space="preserve">Platforms &amp; process: </w:t>
       </w:r>
       <w:r>
         <w:rPr>
@@ -130,28 +143,7 @@
           <w:color w:val="5F5F66"/>
           <w:sz w:val="21"/>
         </w:rPr>
-        <w:t>Salesforce, Magento, Jira</w:t>
-      </w:r>
-    </w:p>
-    <w:p>
-      <w:pPr>
-        <w:spacing w:after="20" w:before="0" w:line="264" w:lineRule="auto"/>
-      </w:pPr>
-      <w:r>
-        <w:rPr>
-          <w:b/>
-          <w:color w:val="18181B"/>
-          <w:sz w:val="21"/>
-        </w:rPr>
-        <w:t xml:space="preserve">QA &amp; Methods: </w:t>
-      </w:r>
-      <w:r>
-        <w:rPr>
-          <w:b w:val="0"/>
-          <w:color w:val="5F5F66"/>
-          <w:sz w:val="21"/>
-        </w:rPr>
-        <w:t>Test planning, Manual testing, Verification &amp; Validation, BDD, Agile, Scrum</w:t>
+        <w:t>Salesforce, Magento, Jira, Agile, Scrum</w:t>
       </w:r>
     </w:p>
     <w:p>
@@ -261,7 +253,7 @@
           <w:color w:val="5F5F66"/>
           <w:sz w:val="20"/>
         </w:rPr>
-        <w:t>Manual test + test plans and Karate automation for enterprise Salesforce releases. API validation with Postman.</w:t>
+        <w:t>Manual testing + test plans and Karate automation for enterprise Salesforce releases. API validation with Postman.</w:t>
       </w:r>
     </w:p>
     <w:p>

</xml_diff>